<commit_message>
docs(dapia): record MAS benchmark round 04
</commit_message>
<xml_diff>
--- a/docs/dapia/Relatorio-de-benchmarking-Especificacao-MAS.docx
+++ b/docs/dapia/Relatorio-de-benchmarking-Especificacao-MAS.docx
@@ -2333,6 +2333,63 @@
           </w:p>
         </w:tc>
       </w:tr>
+      <w:tr>
+        <w:tc>
+          <w:tcPr>
+            <w:tcW w:w="1785" w:type="dxa"/>
+          </w:tcPr>
+          <w:p>
+            <w:r>
+              <w:t>#04</w:t>
+            </w:r>
+          </w:p>
+          <w:p>
+            <w:r>
+              <w:t>07/09</w:t>
+            </w:r>
+          </w:p>
+          <w:p>
+            <w:r>
+              <w:t>correções + P12/P13</w:t>
+            </w:r>
+          </w:p>
+          <w:p>
+            <w:r>
+              <w:t>testes sem Groq verdes</w:t>
+            </w:r>
+          </w:p>
+        </w:tc>
+        <w:tc>
+          <w:tcPr>
+            <w:tcW w:w="2145" w:type="dxa"/>
+          </w:tcPr>
+          <w:p>
+            <w:r>
+              <w:t>Domingo citado cai em domingo; equipamento fora do catálogo aparece na mensagem; P12 reserva e P13 devolve alternativas com --persistir; resumo separa latência líquida e espera 429.</w:t>
+            </w:r>
+          </w:p>
+        </w:tc>
+        <w:tc>
+          <w:tcPr>
+            <w:tcW w:w="2520" w:type="dxa"/>
+          </w:tcPr>
+          <w:p>
+            <w:r>
+              <w:t>Implementado no código. A data divergente é realinhada e avisada. O termo descartado entra na mensagem. duracao_ms deixou de misturar fila HTTP 429. P12/P13 exigem --persistir. Rodada ao vivo com Groq fica no JSON do runner quando a cota permitir.</w:t>
+            </w:r>
+          </w:p>
+        </w:tc>
+        <w:tc>
+          <w:tcPr>
+            <w:tcW w:w="3105" w:type="dxa"/>
+          </w:tcPr>
+          <w:p>
+            <w:r>
+              <w:t>Validação do dia da semana após _coerce_date. normalize_room_search_attributes devolve aceitos e ignorados. Retry curto de 429 com espera_ms. Pedidos P12/P13 no conjunto de teste. Cliente Groq com max_retries=0.</w:t>
+            </w:r>
+          </w:p>
+        </w:tc>
+      </w:tr>
     </w:tbl>
     <w:p>
       <w:pPr>

</xml_diff>